<commit_message>
color change and resume update
</commit_message>
<xml_diff>
--- a/server/files/Prakhar_Agrawal_Resume.docx
+++ b/server/files/Prakhar_Agrawal_Resume.docx
@@ -5,14 +5,19 @@
     <w:p>
       <w:pPr>
         <w:spacing w:after="96" w:line="259" w:lineRule="auto"/>
-        <w:ind w:left="85" w:firstLine="0"/>
+        <w:ind w:left="0" w:firstLine="0"/>
         <w:jc w:val="center"/>
-      </w:pPr>
-      <w:r>
-        <w:rPr>
-          <w:sz w:val="32"/>
-        </w:rPr>
-        <w:t xml:space="preserve">Prakhar Agrawal </w:t>
+        <w:rPr>
+          <w:sz w:val="40"/>
+          <w:szCs w:val="40"/>
+        </w:rPr>
+      </w:pPr>
+      <w:r>
+        <w:rPr>
+          <w:sz w:val="40"/>
+          <w:szCs w:val="40"/>
+        </w:rPr>
+        <w:t>Prakhar Agrawal</w:t>
       </w:r>
     </w:p>
     <w:p>
@@ -20,38 +25,119 @@
         <w:spacing w:after="231" w:line="259" w:lineRule="auto"/>
         <w:ind w:left="86" w:firstLine="0"/>
         <w:jc w:val="center"/>
-      </w:pPr>
-      <w:r>
-        <w:rPr>
-          <w:sz w:val="20"/>
-        </w:rPr>
-        <w:t xml:space="preserve">prakharagrawal@jklu.edu.in | +91 7340243388 | Linkedin: </w:t>
-      </w:r>
-      <w:r>
-        <w:rPr>
-          <w:color w:val="467886"/>
-          <w:sz w:val="20"/>
-          <w:u w:val="single" w:color="467886"/>
-        </w:rPr>
-        <w:t>Prakhar Agrawal</w:t>
-      </w:r>
-      <w:r>
-        <w:rPr>
-          <w:sz w:val="20"/>
-        </w:rPr>
-        <w:t xml:space="preserve"> | Github: prakharAg01 </w:t>
-      </w:r>
-    </w:p>
-    <w:p>
-      <w:pPr>
-        <w:spacing w:after="186" w:line="259" w:lineRule="auto"/>
-        <w:ind w:left="-5"/>
-      </w:pPr>
-      <w:r>
-        <w:rPr>
-          <w:sz w:val="24"/>
-        </w:rPr>
-        <w:t xml:space="preserve">Education </w:t>
+        <w:rPr>
+          <w:sz w:val="24"/>
+        </w:rPr>
+      </w:pPr>
+      <w:hyperlink r:id="rId6" w:history="1">
+        <w:r>
+          <w:rPr>
+            <w:rStyle w:val="Hyperlink"/>
+            <w:sz w:val="24"/>
+          </w:rPr>
+          <w:t>prakharagrawal@jklu.edu.in</w:t>
+        </w:r>
+      </w:hyperlink>
+      <w:r>
+        <w:rPr>
+          <w:sz w:val="24"/>
+        </w:rPr>
+        <w:t xml:space="preserve"> </w:t>
+      </w:r>
+      <w:r>
+        <w:rPr>
+          <w:sz w:val="24"/>
+        </w:rPr>
+        <w:t xml:space="preserve">| +91 7340243388 | </w:t>
+      </w:r>
+      <w:r>
+        <w:rPr>
+          <w:sz w:val="24"/>
+        </w:rPr>
+        <w:t>LinkedIn</w:t>
+      </w:r>
+      <w:r>
+        <w:rPr>
+          <w:sz w:val="24"/>
+        </w:rPr>
+        <w:t xml:space="preserve">: </w:t>
+      </w:r>
+      <w:hyperlink r:id="rId7" w:history="1">
+        <w:r>
+          <w:rPr>
+            <w:rStyle w:val="Hyperlink"/>
+            <w:sz w:val="24"/>
+          </w:rPr>
+          <w:t>Prakhar Ag</w:t>
+        </w:r>
+        <w:r>
+          <w:rPr>
+            <w:rStyle w:val="Hyperlink"/>
+            <w:sz w:val="24"/>
+          </w:rPr>
+          <w:t>r</w:t>
+        </w:r>
+        <w:r>
+          <w:rPr>
+            <w:rStyle w:val="Hyperlink"/>
+            <w:sz w:val="24"/>
+          </w:rPr>
+          <w:t>awal</w:t>
+        </w:r>
+      </w:hyperlink>
+      <w:r>
+        <w:rPr>
+          <w:sz w:val="24"/>
+        </w:rPr>
+        <w:t xml:space="preserve"> | </w:t>
+      </w:r>
+      <w:r>
+        <w:rPr>
+          <w:sz w:val="24"/>
+        </w:rPr>
+        <w:t>GitHub</w:t>
+      </w:r>
+      <w:r>
+        <w:rPr>
+          <w:sz w:val="24"/>
+        </w:rPr>
+        <w:t xml:space="preserve">: </w:t>
+      </w:r>
+      <w:hyperlink r:id="rId8" w:history="1">
+        <w:r>
+          <w:rPr>
+            <w:rStyle w:val="Hyperlink"/>
+            <w:sz w:val="24"/>
+          </w:rPr>
+          <w:t>prakharAg01</w:t>
+        </w:r>
+      </w:hyperlink>
+      <w:r>
+        <w:rPr>
+          <w:sz w:val="24"/>
+        </w:rPr>
+        <w:t xml:space="preserve"> </w:t>
+      </w:r>
+    </w:p>
+    <w:p>
+      <w:pPr>
+        <w:spacing w:after="120" w:line="259" w:lineRule="auto"/>
+        <w:ind w:left="0" w:hanging="14"/>
+        <w:rPr>
+          <w:b/>
+          <w:bCs/>
+          <w:sz w:val="28"/>
+          <w:szCs w:val="28"/>
+        </w:rPr>
+      </w:pPr>
+      <w:r>
+        <w:rPr>
+          <w:b/>
+          <w:bCs/>
+          <w:sz w:val="28"/>
+          <w:szCs w:val="28"/>
+        </w:rPr>
+        <w:t>Education</w:t>
       </w:r>
     </w:p>
     <w:p>
@@ -59,316 +145,856 @@
         <w:tabs>
           <w:tab w:val="right" w:pos="10711"/>
         </w:tabs>
+        <w:spacing w:before="120" w:after="0" w:line="240" w:lineRule="auto"/>
         <w:ind w:left="0" w:firstLine="0"/>
-      </w:pPr>
-      <w:r>
-        <w:t xml:space="preserve">JK Lakshmipat University, Jaipur, Rajasthan  </w:t>
-      </w:r>
-      <w:r>
+        <w:rPr>
+          <w:b/>
+          <w:bCs/>
+          <w:sz w:val="24"/>
+        </w:rPr>
+      </w:pPr>
+      <w:r>
+        <w:rPr>
+          <w:b/>
+          <w:bCs/>
+          <w:sz w:val="24"/>
+        </w:rPr>
+        <w:t>Bachelor of Technology in Computer and Communications Engineering</w:t>
+      </w:r>
+      <w:r>
+        <w:rPr>
+          <w:b/>
+          <w:bCs/>
+          <w:sz w:val="24"/>
+        </w:rPr>
         <w:tab/>
       </w:r>
       <w:r>
         <w:rPr>
-          <w:sz w:val="24"/>
-        </w:rPr>
-        <w:t>CGPA: 7.48 (3</w:t>
-      </w:r>
-      <w:r>
-        <w:rPr>
+          <w:b/>
+          <w:bCs/>
+          <w:sz w:val="24"/>
+        </w:rPr>
+        <w:t>2023-2027</w:t>
+      </w:r>
+    </w:p>
+    <w:p>
+      <w:pPr>
+        <w:tabs>
+          <w:tab w:val="right" w:pos="10711"/>
+        </w:tabs>
+        <w:spacing w:after="0" w:line="240" w:lineRule="auto"/>
+        <w:ind w:left="0" w:firstLine="0"/>
+        <w:rPr>
+          <w:sz w:val="24"/>
+        </w:rPr>
+      </w:pPr>
+      <w:r>
+        <w:rPr>
+          <w:i/>
+          <w:iCs/>
+          <w:sz w:val="24"/>
+        </w:rPr>
+        <w:t>JK Lakshmipat University, Jaipur, Rajasthan</w:t>
+      </w:r>
+      <w:r>
+        <w:rPr>
+          <w:sz w:val="24"/>
+        </w:rPr>
+        <w:tab/>
+      </w:r>
+      <w:r>
+        <w:rPr>
+          <w:sz w:val="24"/>
+        </w:rPr>
+        <w:t>CGPA: 7.88</w:t>
+      </w:r>
+    </w:p>
+    <w:p>
+      <w:pPr>
+        <w:tabs>
+          <w:tab w:val="right" w:pos="10711"/>
+        </w:tabs>
+        <w:spacing w:before="120" w:after="0" w:line="240" w:lineRule="auto"/>
+        <w:ind w:left="0" w:firstLine="0"/>
+        <w:rPr>
+          <w:b/>
+          <w:bCs/>
+          <w:sz w:val="24"/>
+        </w:rPr>
+      </w:pPr>
+      <w:r>
+        <w:rPr>
+          <w:b/>
+          <w:bCs/>
+          <w:sz w:val="24"/>
+        </w:rPr>
+        <w:t>Senior Secondary (12</w:t>
+      </w:r>
+      <w:r>
+        <w:rPr>
+          <w:b/>
+          <w:bCs/>
+          <w:sz w:val="24"/>
           <w:vertAlign w:val="superscript"/>
         </w:rPr>
-        <w:t>rd</w:t>
-      </w:r>
-      <w:r>
-        <w:rPr>
-          <w:sz w:val="24"/>
-        </w:rPr>
-        <w:t xml:space="preserve"> Sem.) </w:t>
+        <w:t>th</w:t>
+      </w:r>
+      <w:r>
+        <w:rPr>
+          <w:b/>
+          <w:bCs/>
+          <w:sz w:val="24"/>
+        </w:rPr>
+        <w:t>), CBSE</w:t>
+      </w:r>
+      <w:r>
+        <w:rPr>
+          <w:b/>
+          <w:bCs/>
+          <w:sz w:val="24"/>
+        </w:rPr>
+        <w:tab/>
+      </w:r>
+      <w:r>
+        <w:rPr>
+          <w:b/>
+          <w:bCs/>
+          <w:sz w:val="24"/>
+        </w:rPr>
+        <w:t>2022</w:t>
       </w:r>
     </w:p>
     <w:p>
       <w:pPr>
         <w:tabs>
-          <w:tab w:val="center" w:pos="8028"/>
+          <w:tab w:val="right" w:pos="10711"/>
         </w:tabs>
-        <w:spacing w:after="243"/>
+        <w:spacing w:after="0" w:line="240" w:lineRule="auto"/>
         <w:ind w:left="0" w:firstLine="0"/>
-      </w:pPr>
-      <w:r>
-        <w:t xml:space="preserve">BTech Computer and Communications Engineering (CCE) (2023-27) </w:t>
-      </w:r>
-      <w:r>
+        <w:rPr>
+          <w:sz w:val="24"/>
+        </w:rPr>
+      </w:pPr>
+      <w:r>
+        <w:rPr>
+          <w:i/>
+          <w:iCs/>
+          <w:sz w:val="24"/>
+        </w:rPr>
+        <w:t>Maheshwari Public School, Pratap Nagar, Jaipur, Rajasthan</w:t>
+      </w:r>
+      <w:r>
+        <w:rPr>
+          <w:sz w:val="24"/>
+        </w:rPr>
         <w:tab/>
       </w:r>
       <w:r>
         <w:rPr>
           <w:sz w:val="24"/>
         </w:rPr>
-        <w:t xml:space="preserve"> </w:t>
-      </w:r>
-    </w:p>
-    <w:p>
-      <w:pPr>
-        <w:spacing w:after="224"/>
-        <w:ind w:right="441"/>
-      </w:pPr>
-      <w:r>
-        <w:t xml:space="preserve">Maheshwari Public School, Pratap Nagar, Jaipur, Rajasthan  </w:t>
-      </w:r>
-      <w:r>
+        <w:t>79.2%</w:t>
+      </w:r>
+    </w:p>
+    <w:p>
+      <w:pPr>
+        <w:tabs>
+          <w:tab w:val="right" w:pos="10711"/>
+        </w:tabs>
+        <w:spacing w:before="120" w:after="0" w:line="240" w:lineRule="auto"/>
+        <w:ind w:left="0" w:firstLine="0"/>
+        <w:rPr>
+          <w:b/>
+          <w:bCs/>
+          <w:sz w:val="24"/>
+        </w:rPr>
+      </w:pPr>
+      <w:r>
+        <w:rPr>
+          <w:b/>
+          <w:bCs/>
+          <w:sz w:val="24"/>
+        </w:rPr>
+        <w:t>Secondary (10</w:t>
+      </w:r>
+      <w:r>
+        <w:rPr>
+          <w:b/>
+          <w:bCs/>
+          <w:sz w:val="24"/>
+          <w:vertAlign w:val="superscript"/>
+        </w:rPr>
+        <w:t>th</w:t>
+      </w:r>
+      <w:r>
+        <w:rPr>
+          <w:b/>
+          <w:bCs/>
+          <w:sz w:val="24"/>
+        </w:rPr>
+        <w:t>), CBSE</w:t>
+      </w:r>
+      <w:r>
+        <w:rPr>
+          <w:b/>
+          <w:bCs/>
+          <w:sz w:val="24"/>
+        </w:rPr>
         <w:tab/>
       </w:r>
       <w:r>
         <w:rPr>
-          <w:sz w:val="24"/>
-        </w:rPr>
-        <w:t xml:space="preserve">Grade: 79.2%  </w:t>
-      </w:r>
-      <w:r>
-        <w:t xml:space="preserve">CBSE 12th (2022) </w:t>
-      </w:r>
-    </w:p>
-    <w:p>
-      <w:pPr>
-        <w:spacing w:after="244"/>
-        <w:ind w:right="482"/>
-      </w:pPr>
-      <w:r>
-        <w:t xml:space="preserve">Maheshwari Public School, Pratap Nagar, Jaipur, Rajasthan  </w:t>
-      </w:r>
-      <w:r>
+          <w:b/>
+          <w:bCs/>
+          <w:sz w:val="24"/>
+        </w:rPr>
+        <w:t>2020</w:t>
+      </w:r>
+    </w:p>
+    <w:p>
+      <w:pPr>
+        <w:tabs>
+          <w:tab w:val="right" w:pos="10711"/>
+        </w:tabs>
+        <w:spacing w:after="120" w:line="240" w:lineRule="auto"/>
+        <w:ind w:left="0" w:firstLine="0"/>
+        <w:rPr>
+          <w:b/>
+          <w:bCs/>
+          <w:sz w:val="24"/>
+        </w:rPr>
+      </w:pPr>
+      <w:r>
+        <w:rPr>
+          <w:i/>
+          <w:iCs/>
+          <w:sz w:val="24"/>
+        </w:rPr>
+        <w:t>Maheshwari Public School, Pratap Nagar, Jaipur, Rajasthan</w:t>
+      </w:r>
+      <w:r>
+        <w:rPr>
+          <w:sz w:val="24"/>
+        </w:rPr>
         <w:tab/>
       </w:r>
       <w:r>
         <w:rPr>
           <w:sz w:val="24"/>
         </w:rPr>
-        <w:t xml:space="preserve">Grade: 91.8%  </w:t>
-      </w:r>
-      <w:r>
-        <w:t xml:space="preserve">CBSE 10th (2020) </w:t>
-      </w:r>
-    </w:p>
-    <w:p>
-      <w:pPr>
-        <w:spacing w:after="310" w:line="259" w:lineRule="auto"/>
-        <w:ind w:left="-5"/>
-      </w:pPr>
-      <w:r>
-        <w:rPr>
-          <w:sz w:val="24"/>
-        </w:rPr>
-        <w:t xml:space="preserve">Academic Projects </w:t>
-      </w:r>
-    </w:p>
-    <w:p>
-      <w:pPr>
+        <w:t>91.8%</w:t>
+      </w:r>
+    </w:p>
+    <w:p>
+      <w:pPr>
+        <w:spacing w:after="60" w:line="259" w:lineRule="auto"/>
+        <w:ind w:left="0" w:firstLine="0"/>
+        <w:rPr>
+          <w:b/>
+          <w:bCs/>
+          <w:sz w:val="28"/>
+          <w:szCs w:val="28"/>
+        </w:rPr>
+      </w:pPr>
+      <w:r>
+        <w:rPr>
+          <w:b/>
+          <w:bCs/>
+          <w:sz w:val="28"/>
+          <w:szCs w:val="28"/>
+        </w:rPr>
+        <w:t>Experience</w:t>
+      </w:r>
+    </w:p>
+    <w:p>
+      <w:pPr>
+        <w:spacing w:after="0" w:line="259" w:lineRule="auto"/>
+        <w:ind w:left="-720" w:right="-809" w:firstLine="720"/>
+        <w:rPr>
+          <w:b/>
+          <w:bCs/>
+          <w:sz w:val="24"/>
+        </w:rPr>
+      </w:pPr>
+      <w:r>
+        <w:rPr>
+          <w:b/>
+          <w:bCs/>
+          <w:sz w:val="24"/>
+        </w:rPr>
+        <w:t>Machine Learning Intern</w:t>
+      </w:r>
+      <w:r>
+        <w:rPr>
+          <w:b/>
+          <w:bCs/>
+          <w:sz w:val="24"/>
+        </w:rPr>
+        <w:tab/>
+      </w:r>
+      <w:r>
+        <w:rPr>
+          <w:b/>
+          <w:bCs/>
+          <w:sz w:val="24"/>
+        </w:rPr>
+        <w:t>May-June 2025</w:t>
+      </w:r>
+    </w:p>
+    <w:p>
+      <w:pPr>
+        <w:spacing w:after="0" w:line="259" w:lineRule="auto"/>
+        <w:ind w:left="0" w:firstLine="0"/>
+        <w:rPr>
+          <w:i/>
+          <w:iCs/>
+          <w:sz w:val="24"/>
+        </w:rPr>
+      </w:pPr>
+      <w:r>
+        <w:rPr>
+          <w:i/>
+          <w:iCs/>
+          <w:sz w:val="24"/>
+        </w:rPr>
+        <w:t>LUSIP-2025, LNMIIT Jaipur</w:t>
+      </w:r>
+    </w:p>
+    <w:p>
+      <w:pPr>
+        <w:spacing w:after="120" w:line="259" w:lineRule="auto"/>
+        <w:ind w:left="0" w:firstLine="0"/>
+        <w:rPr>
+          <w:sz w:val="24"/>
+        </w:rPr>
+      </w:pPr>
+      <w:r>
+        <w:rPr>
+          <w:sz w:val="24"/>
+        </w:rPr>
+        <w:t>Worked on the hardware implementation of a Yoga Pose Recognition system using Deep Learning to understand system architecture, evaluate suitable ML/DL models, and find low-power solutions refined for Raspberry Pi 4 deployment. Applied these insights to develop a real-time American Sign Language Recognition system using a Random Forest model for efficient Raspberry Pi-based edge deployment.</w:t>
+      </w:r>
+    </w:p>
+    <w:p>
+      <w:pPr>
+        <w:spacing w:after="60" w:line="259" w:lineRule="auto"/>
+        <w:ind w:left="0" w:firstLine="0"/>
+        <w:rPr>
+          <w:b/>
+          <w:bCs/>
+          <w:sz w:val="28"/>
+          <w:szCs w:val="28"/>
+        </w:rPr>
+      </w:pPr>
+      <w:r>
+        <w:rPr>
+          <w:b/>
+          <w:bCs/>
+          <w:sz w:val="28"/>
+          <w:szCs w:val="28"/>
+        </w:rPr>
+        <w:t>Proje</w:t>
+      </w:r>
+      <w:r>
+        <w:rPr>
+          <w:b/>
+          <w:bCs/>
+          <w:sz w:val="28"/>
+          <w:szCs w:val="28"/>
+        </w:rPr>
+        <w:t>cts</w:t>
+      </w:r>
+    </w:p>
+    <w:p>
+      <w:pPr>
+        <w:spacing w:after="0" w:line="240" w:lineRule="auto"/>
+        <w:ind w:left="0" w:hanging="14"/>
+        <w:rPr>
+          <w:b/>
+          <w:bCs/>
+          <w:sz w:val="28"/>
+          <w:szCs w:val="28"/>
+        </w:rPr>
+      </w:pPr>
+      <w:r>
+        <w:rPr>
+          <w:b/>
+          <w:bCs/>
+          <w:sz w:val="24"/>
+        </w:rPr>
+        <w:t>CodeCampus – Coding Platform for Colleg</w:t>
+      </w:r>
+      <w:r>
+        <w:rPr>
+          <w:b/>
+          <w:bCs/>
+          <w:sz w:val="24"/>
+        </w:rPr>
+        <w:t>es</w:t>
+      </w:r>
+      <w:r>
+        <w:rPr>
+          <w:b/>
+          <w:bCs/>
+          <w:sz w:val="24"/>
+        </w:rPr>
+        <w:tab/>
+      </w:r>
+      <w:hyperlink r:id="rId9" w:history="1">
+        <w:r>
+          <w:rPr>
+            <w:rStyle w:val="Hyperlink"/>
+            <w:b/>
+            <w:bCs/>
+            <w:sz w:val="24"/>
+          </w:rPr>
+          <w:t>GitHub Link</w:t>
+        </w:r>
+      </w:hyperlink>
+    </w:p>
+    <w:p>
+      <w:pPr>
+        <w:spacing w:after="120" w:line="240" w:lineRule="auto"/>
+        <w:ind w:left="0" w:hanging="14"/>
+        <w:contextualSpacing/>
+        <w:rPr>
+          <w:b/>
+          <w:bCs/>
+          <w:sz w:val="24"/>
+        </w:rPr>
+      </w:pPr>
+      <w:r>
+        <w:rPr>
+          <w:i/>
+          <w:iCs/>
+          <w:sz w:val="24"/>
+        </w:rPr>
+        <w:t>Tech</w:t>
+      </w:r>
+      <w:r>
+        <w:rPr>
+          <w:i/>
+          <w:iCs/>
+          <w:sz w:val="24"/>
+        </w:rPr>
+        <w:t>:</w:t>
+      </w:r>
+      <w:r>
+        <w:rPr>
+          <w:i/>
+          <w:iCs/>
+          <w:sz w:val="24"/>
+        </w:rPr>
+        <w:t xml:space="preserve"> React.js, Tailwind CSS, Node.js, Express.js, MongoDB, JWT, Bcrypt, NodeCron</w:t>
+      </w:r>
+    </w:p>
+    <w:p>
+      <w:pPr>
+        <w:spacing w:after="120" w:line="240" w:lineRule="auto"/>
+        <w:ind w:left="0" w:firstLine="0"/>
+        <w:contextualSpacing/>
+        <w:rPr>
+          <w:sz w:val="24"/>
+        </w:rPr>
+      </w:pPr>
+      <w:r>
+        <w:rPr>
+          <w:sz w:val="24"/>
+        </w:rPr>
+        <w:t>Built a full-stack MERN-based coding platform and LMS for educational institutions featuring real-time code execution, contest/lab management, leaderboards, gamification, and TA/instructor dashboards for performance tracking and academic workflow automation.</w:t>
+      </w:r>
+    </w:p>
+    <w:p>
+      <w:pPr>
+        <w:spacing w:before="240" w:after="0" w:line="259" w:lineRule="auto"/>
+        <w:ind w:left="0" w:hanging="14"/>
+        <w:rPr>
+          <w:b/>
+          <w:bCs/>
+          <w:sz w:val="24"/>
+        </w:rPr>
+      </w:pPr>
+      <w:r>
+        <w:rPr>
+          <w:b/>
+          <w:bCs/>
+          <w:sz w:val="24"/>
+        </w:rPr>
+        <w:t>American Sign Language Recognition using Machine Learning on Raspberry Pi</w:t>
+      </w:r>
+      <w:r>
+        <w:rPr>
+          <w:b/>
+          <w:bCs/>
+          <w:sz w:val="24"/>
+        </w:rPr>
+        <w:tab/>
+      </w:r>
+      <w:hyperlink r:id="rId10" w:history="1">
+        <w:r>
+          <w:rPr>
+            <w:rStyle w:val="Hyperlink"/>
+            <w:b/>
+            <w:bCs/>
+            <w:sz w:val="24"/>
+          </w:rPr>
+          <w:t>GitHub Link</w:t>
+        </w:r>
+      </w:hyperlink>
+    </w:p>
+    <w:p>
+      <w:pPr>
+        <w:spacing w:after="0" w:line="259" w:lineRule="auto"/>
+        <w:ind w:left="0" w:hanging="14"/>
+        <w:rPr>
+          <w:i/>
+          <w:iCs/>
+          <w:sz w:val="24"/>
+        </w:rPr>
+      </w:pPr>
+      <w:r>
+        <w:rPr>
+          <w:i/>
+          <w:iCs/>
+          <w:sz w:val="24"/>
+        </w:rPr>
+        <w:t>Tech: Python, MediaPipe, OpenCV, Machine Learning (Random Forest, scikit-learn), Raspberry Pi</w:t>
+      </w:r>
+    </w:p>
+    <w:p>
+      <w:pPr>
+        <w:spacing w:after="0" w:line="259" w:lineRule="auto"/>
+        <w:ind w:left="14" w:hanging="14"/>
+        <w:rPr>
+          <w:sz w:val="24"/>
+        </w:rPr>
+      </w:pPr>
+      <w:r>
+        <w:rPr>
+          <w:sz w:val="24"/>
+        </w:rPr>
+        <w:t>Developed a real-time American Sign Language (ASL) recognition system using MediaPipe-based hand landmark extraction and Random Forest classification, achieving 94%+ accuracy on a custom 9,000+ image dataset; optimized for Raspberry Pi deployment as a portable, low-cost assistive solution.</w:t>
+      </w:r>
+    </w:p>
+    <w:p>
+      <w:pPr>
+        <w:spacing w:before="120" w:after="60" w:line="259" w:lineRule="auto"/>
+        <w:ind w:left="0" w:firstLine="0"/>
+        <w:rPr>
+          <w:b/>
+          <w:bCs/>
+          <w:sz w:val="28"/>
+          <w:szCs w:val="28"/>
+        </w:rPr>
+      </w:pPr>
+      <w:r>
+        <w:rPr>
+          <w:b/>
+          <w:bCs/>
+          <w:sz w:val="28"/>
+          <w:szCs w:val="28"/>
+        </w:rPr>
+        <w:t>Skills</w:t>
+      </w:r>
+    </w:p>
+    <w:p>
+      <w:pPr>
+        <w:pStyle w:val="ListParagraph"/>
         <w:numPr>
           <w:ilvl w:val="0"/>
-          <w:numId w:val="1"/>
+          <w:numId w:val="3"/>
         </w:numPr>
-        <w:spacing w:after="0" w:line="259" w:lineRule="auto"/>
-        <w:ind w:hanging="360"/>
-      </w:pPr>
-      <w:r>
-        <w:t xml:space="preserve">BCD to 7-Segment Display Decoder </w:t>
-      </w:r>
-    </w:p>
-    <w:p>
-      <w:pPr>
-        <w:ind w:left="730"/>
-      </w:pPr>
-      <w:r>
-        <w:t xml:space="preserve">Platform/Technologies used: Xilinx Vivado, VHDL  </w:t>
-      </w:r>
-    </w:p>
-    <w:p>
-      <w:pPr>
-        <w:ind w:left="730"/>
-      </w:pPr>
-      <w:r>
-        <w:t xml:space="preserve">Designed and implemented a combinational logic circuit that converts Binary Coded Decimal (BCD) input into a 7-segment display output. Utilized logic gates and multiplexing techniques to correctly display numbers 0-9. Demonstrated proficiency in digital design, binary-to-BCD conversion, and hardware interfacing using VHDL on Xilinx Vivado. </w:t>
-      </w:r>
-    </w:p>
-    <w:p>
-      <w:pPr>
+        <w:spacing w:before="120" w:after="120" w:line="259" w:lineRule="auto"/>
+        <w:rPr>
+          <w:sz w:val="24"/>
+        </w:rPr>
+      </w:pPr>
+      <w:r>
+        <w:rPr>
+          <w:b/>
+          <w:bCs/>
+          <w:sz w:val="24"/>
+        </w:rPr>
+        <w:t>Programming</w:t>
+      </w:r>
+      <w:r>
+        <w:rPr>
+          <w:b/>
+          <w:bCs/>
+          <w:sz w:val="24"/>
+        </w:rPr>
+        <w:t xml:space="preserve"> Languages</w:t>
+      </w:r>
+      <w:r>
+        <w:rPr>
+          <w:b/>
+          <w:bCs/>
+          <w:sz w:val="24"/>
+        </w:rPr>
+        <w:t>:</w:t>
+      </w:r>
+      <w:r>
+        <w:rPr>
+          <w:sz w:val="24"/>
+        </w:rPr>
+        <w:t xml:space="preserve"> C, Python, VHDL</w:t>
+      </w:r>
+      <w:r>
+        <w:rPr>
+          <w:sz w:val="24"/>
+        </w:rPr>
+        <w:t>, Verilog, System Verilog</w:t>
+      </w:r>
+    </w:p>
+    <w:p>
+      <w:pPr>
+        <w:pStyle w:val="ListParagraph"/>
         <w:numPr>
           <w:ilvl w:val="0"/>
-          <w:numId w:val="1"/>
+          <w:numId w:val="3"/>
         </w:numPr>
-        <w:spacing w:after="35"/>
-        <w:ind w:hanging="360"/>
-      </w:pPr>
-      <w:r>
-        <w:t xml:space="preserve">Digital Stopwatch using 7-Segment Display Platform/Technologies used: Xilinx Vivado, VHDL </w:t>
-      </w:r>
-    </w:p>
-    <w:p>
-      <w:pPr>
-        <w:spacing w:after="41"/>
-        <w:ind w:left="730"/>
-      </w:pPr>
-      <w:r>
-        <w:t xml:space="preserve">Implemented clock division to generate a 1 Hz timing signal, designed a finite state machine (FSM) for control logic, and utilized counters for timekeeping. Controlled a 7segment display to show elapsed time in seconds and minutes. </w:t>
-      </w:r>
-    </w:p>
-    <w:p>
-      <w:pPr>
+        <w:spacing w:before="120" w:after="120" w:line="259" w:lineRule="auto"/>
+        <w:rPr>
+          <w:sz w:val="24"/>
+        </w:rPr>
+      </w:pPr>
+      <w:r>
+        <w:rPr>
+          <w:b/>
+          <w:bCs/>
+          <w:sz w:val="24"/>
+        </w:rPr>
+        <w:t xml:space="preserve">Full Stack Web </w:t>
+      </w:r>
+      <w:r>
+        <w:rPr>
+          <w:b/>
+          <w:bCs/>
+          <w:sz w:val="24"/>
+        </w:rPr>
+        <w:t>Development:</w:t>
+      </w:r>
+      <w:r>
+        <w:rPr>
+          <w:sz w:val="24"/>
+        </w:rPr>
+        <w:t xml:space="preserve"> </w:t>
+      </w:r>
+      <w:r>
+        <w:rPr>
+          <w:sz w:val="24"/>
+        </w:rPr>
+        <w:t>React.js, Tailwind CSS, Node.js, Express.js, MongoDB</w:t>
+      </w:r>
+    </w:p>
+    <w:p>
+      <w:pPr>
+        <w:pStyle w:val="ListParagraph"/>
         <w:numPr>
           <w:ilvl w:val="0"/>
-          <w:numId w:val="1"/>
+          <w:numId w:val="3"/>
         </w:numPr>
-        <w:spacing w:after="36" w:line="259" w:lineRule="auto"/>
-        <w:ind w:hanging="360"/>
-      </w:pPr>
-      <w:r>
-        <w:t xml:space="preserve">JK-Buzz – University Communication App </w:t>
-      </w:r>
-    </w:p>
-    <w:p>
-      <w:pPr>
-        <w:spacing w:after="39"/>
-        <w:ind w:left="730"/>
-      </w:pPr>
-      <w:r>
-        <w:t xml:space="preserve">Platform/Technologies used: Figma </w:t>
-      </w:r>
-    </w:p>
-    <w:p>
-      <w:pPr>
-        <w:spacing w:after="41"/>
-        <w:ind w:left="730"/>
-      </w:pPr>
-      <w:r>
-        <w:t xml:space="preserve">Developed JKBuzz, a campus communication app for JKLU using Design Thinking. Conducted user research, ideated solutions, and designed Figma prototypes to enhance connectivity and community engagement. </w:t>
-      </w:r>
-    </w:p>
-    <w:p>
-      <w:pPr>
+        <w:spacing w:before="120" w:after="120" w:line="259" w:lineRule="auto"/>
+        <w:rPr>
+          <w:sz w:val="24"/>
+        </w:rPr>
+      </w:pPr>
+      <w:r>
+        <w:rPr>
+          <w:b/>
+          <w:bCs/>
+          <w:sz w:val="24"/>
+        </w:rPr>
+        <w:t>AI/ML:</w:t>
+      </w:r>
+      <w:r>
+        <w:rPr>
+          <w:sz w:val="24"/>
+        </w:rPr>
+        <w:t xml:space="preserve"> </w:t>
+      </w:r>
+      <w:proofErr w:type="spellStart"/>
+      <w:r>
+        <w:rPr>
+          <w:sz w:val="24"/>
+        </w:rPr>
+        <w:t>Pytorch</w:t>
+      </w:r>
+      <w:proofErr w:type="spellEnd"/>
+      <w:r>
+        <w:rPr>
+          <w:sz w:val="24"/>
+        </w:rPr>
+        <w:t>/TensorFlow, OpenCV, scikit-learn</w:t>
+      </w:r>
+    </w:p>
+    <w:p>
+      <w:pPr>
+        <w:pStyle w:val="ListParagraph"/>
         <w:numPr>
           <w:ilvl w:val="0"/>
-          <w:numId w:val="1"/>
+          <w:numId w:val="3"/>
         </w:numPr>
-        <w:spacing w:after="36" w:line="259" w:lineRule="auto"/>
-        <w:ind w:hanging="360"/>
-      </w:pPr>
-      <w:r>
-        <w:t xml:space="preserve">Triply – Group Travel Management App </w:t>
-      </w:r>
-    </w:p>
-    <w:p>
-      <w:pPr>
-        <w:spacing w:after="37"/>
-        <w:ind w:left="730"/>
-      </w:pPr>
-      <w:r>
-        <w:t xml:space="preserve">Platform/Technologies used: HTML, CSS, JS, Java, PostgreSQL </w:t>
-      </w:r>
-    </w:p>
-    <w:p>
-      <w:pPr>
-        <w:spacing w:after="272"/>
-        <w:ind w:left="730"/>
-      </w:pPr>
-      <w:r>
-        <w:t xml:space="preserve">Created an all-in-one group travel management application during LNMIIT's LNMHacks v7.0 Hackathon, integrating real-time expense splitting, itinerary planning, and group chat functionalities to enhance collaboration and streamline travel coordination. </w:t>
-      </w:r>
-    </w:p>
-    <w:p>
-      <w:pPr>
-        <w:spacing w:after="243" w:line="259" w:lineRule="auto"/>
-        <w:ind w:left="10"/>
-      </w:pPr>
-      <w:r>
-        <w:t xml:space="preserve">Skills </w:t>
-      </w:r>
-    </w:p>
-    <w:p>
-      <w:pPr>
+        <w:spacing w:before="120" w:after="120" w:line="259" w:lineRule="auto"/>
+        <w:rPr>
+          <w:sz w:val="24"/>
+        </w:rPr>
+      </w:pPr>
+      <w:r>
+        <w:rPr>
+          <w:b/>
+          <w:bCs/>
+          <w:sz w:val="24"/>
+        </w:rPr>
+        <w:t>Embedded Systems &amp; FPGA:</w:t>
+      </w:r>
+      <w:r>
+        <w:rPr>
+          <w:sz w:val="24"/>
+        </w:rPr>
+        <w:t xml:space="preserve"> Basic Circuit Design, Arduino</w:t>
+      </w:r>
+    </w:p>
+    <w:p>
+      <w:pPr>
+        <w:pStyle w:val="ListParagraph"/>
         <w:numPr>
           <w:ilvl w:val="0"/>
-          <w:numId w:val="1"/>
+          <w:numId w:val="3"/>
         </w:numPr>
-        <w:ind w:hanging="360"/>
-      </w:pPr>
-      <w:r>
-        <w:t xml:space="preserve">Programming: C, Python, VHDL </w:t>
-      </w:r>
-    </w:p>
-    <w:p>
-      <w:pPr>
+        <w:spacing w:before="120" w:after="120" w:line="259" w:lineRule="auto"/>
+        <w:rPr>
+          <w:b/>
+          <w:bCs/>
+          <w:sz w:val="28"/>
+          <w:szCs w:val="28"/>
+        </w:rPr>
+      </w:pPr>
+      <w:r>
+        <w:rPr>
+          <w:b/>
+          <w:bCs/>
+          <w:sz w:val="24"/>
+        </w:rPr>
+        <w:t>Tools:</w:t>
+      </w:r>
+      <w:r>
+        <w:rPr>
+          <w:sz w:val="24"/>
+        </w:rPr>
+        <w:t xml:space="preserve"> Git, </w:t>
+      </w:r>
+      <w:r>
+        <w:rPr>
+          <w:sz w:val="24"/>
+        </w:rPr>
+        <w:t xml:space="preserve">Postman, </w:t>
+      </w:r>
+      <w:r>
+        <w:rPr>
+          <w:sz w:val="24"/>
+        </w:rPr>
+        <w:t xml:space="preserve">Xilinx </w:t>
+      </w:r>
+      <w:proofErr w:type="spellStart"/>
+      <w:r>
+        <w:rPr>
+          <w:sz w:val="24"/>
+        </w:rPr>
+        <w:t>Vivado</w:t>
+      </w:r>
+      <w:proofErr w:type="spellEnd"/>
+      <w:r>
+        <w:rPr>
+          <w:sz w:val="24"/>
+        </w:rPr>
+        <w:t xml:space="preserve">, </w:t>
+      </w:r>
+      <w:proofErr w:type="spellStart"/>
+      <w:r>
+        <w:rPr>
+          <w:sz w:val="24"/>
+        </w:rPr>
+        <w:t>MicroCap</w:t>
+      </w:r>
+      <w:proofErr w:type="spellEnd"/>
+    </w:p>
+    <w:p>
+      <w:pPr>
+        <w:spacing w:before="120" w:after="120" w:line="240" w:lineRule="auto"/>
+        <w:ind w:left="10"/>
+        <w:rPr>
+          <w:b/>
+          <w:bCs/>
+          <w:sz w:val="28"/>
+          <w:szCs w:val="28"/>
+        </w:rPr>
+      </w:pPr>
+      <w:r>
+        <w:rPr>
+          <w:b/>
+          <w:bCs/>
+          <w:sz w:val="28"/>
+          <w:szCs w:val="28"/>
+        </w:rPr>
+        <w:t>Certifications</w:t>
+      </w:r>
+    </w:p>
+    <w:p>
+      <w:pPr>
+        <w:pStyle w:val="ListParagraph"/>
         <w:numPr>
           <w:ilvl w:val="0"/>
-          <w:numId w:val="1"/>
+          <w:numId w:val="4"/>
         </w:numPr>
-        <w:ind w:hanging="360"/>
-      </w:pPr>
-      <w:r>
-        <w:t xml:space="preserve">Web Development: HTML, CSS </w:t>
-      </w:r>
-    </w:p>
-    <w:p>
-      <w:pPr>
+        <w:spacing w:before="120" w:after="120" w:line="240" w:lineRule="auto"/>
+        <w:rPr>
+          <w:sz w:val="24"/>
+        </w:rPr>
+      </w:pPr>
+      <w:r>
+        <w:rPr>
+          <w:sz w:val="24"/>
+        </w:rPr>
+        <w:t>Red Hat System Administration I (RH124</w:t>
+      </w:r>
+      <w:r>
+        <w:rPr>
+          <w:sz w:val="24"/>
+        </w:rPr>
+        <w:t xml:space="preserve"> </w:t>
+      </w:r>
+      <w:r>
+        <w:rPr>
+          <w:sz w:val="24"/>
+        </w:rPr>
+        <w:t>- RHA)</w:t>
+      </w:r>
+      <w:r>
+        <w:rPr>
+          <w:sz w:val="24"/>
+        </w:rPr>
+        <w:t xml:space="preserve"> | Red Hat Academy</w:t>
+      </w:r>
+    </w:p>
+    <w:p>
+      <w:pPr>
+        <w:pStyle w:val="ListParagraph"/>
         <w:numPr>
           <w:ilvl w:val="0"/>
-          <w:numId w:val="1"/>
+          <w:numId w:val="4"/>
         </w:numPr>
-        <w:ind w:hanging="360"/>
-      </w:pPr>
-      <w:r>
-        <w:t xml:space="preserve">Embedded Systems &amp; FPGA: Xilinx Vivado, VHDL </w:t>
-      </w:r>
-    </w:p>
-    <w:p>
-      <w:pPr>
-        <w:numPr>
-          <w:ilvl w:val="0"/>
-          <w:numId w:val="1"/>
-        </w:numPr>
-        <w:spacing w:after="248"/>
-        <w:ind w:hanging="360"/>
-      </w:pPr>
-      <w:r>
-        <w:t xml:space="preserve">Simple Signal Analysis </w:t>
-      </w:r>
-    </w:p>
-    <w:p>
-      <w:pPr>
-        <w:spacing w:after="229" w:line="259" w:lineRule="auto"/>
-        <w:ind w:left="10"/>
-      </w:pPr>
-      <w:r>
-        <w:t>Certifications</w:t>
-      </w:r>
-      <w:r>
-        <w:rPr>
-          <w:sz w:val="24"/>
-        </w:rPr>
-        <w:t xml:space="preserve"> </w:t>
-      </w:r>
-    </w:p>
-    <w:p>
-      <w:pPr>
-        <w:numPr>
-          <w:ilvl w:val="0"/>
-          <w:numId w:val="1"/>
-        </w:numPr>
-        <w:ind w:hanging="360"/>
-      </w:pPr>
-      <w:r>
-        <w:t xml:space="preserve">Hands-on Training, Research Aspects and Demonstrations in 5G Use Case Lab | AICTE Training and Learning (ATAL) Academy | (Punjab Engineering College) </w:t>
-      </w:r>
-    </w:p>
-    <w:p>
-      <w:pPr>
-        <w:numPr>
-          <w:ilvl w:val="0"/>
-          <w:numId w:val="1"/>
-        </w:numPr>
-        <w:ind w:hanging="360"/>
-      </w:pPr>
-      <w:r>
-        <w:t xml:space="preserve">C Programming for Everybody | University of Michigan | Coursera </w:t>
+        <w:spacing w:before="120" w:after="120" w:line="240" w:lineRule="auto"/>
+        <w:rPr>
+          <w:sz w:val="24"/>
+        </w:rPr>
+      </w:pPr>
+      <w:r>
+        <w:rPr>
+          <w:sz w:val="24"/>
+        </w:rPr>
+        <w:t>Hands-on Training, Research Aspects and Demonstrations in 5G Use Case Lab | AICTE Training and Learning (ATAL) Academy | Punjab Engineering College</w:t>
       </w:r>
     </w:p>
     <w:sectPr>
@@ -383,6 +1009,494 @@
 <file path=word/numbering.xml><?xml version="1.0" encoding="utf-8"?>
 <w:numbering xmlns:wpc="http://schemas.microsoft.com/office/word/2010/wordprocessingCanvas" xmlns:cx="http://schemas.microsoft.com/office/drawing/2014/chartex" xmlns:cx1="http://schemas.microsoft.com/office/drawing/2015/9/8/chartex" xmlns:cx2="http://schemas.microsoft.com/office/drawing/2015/10/21/chartex" xmlns:cx3="http://schemas.microsoft.com/office/drawing/2016/5/9/chartex" xmlns:cx4="http://schemas.microsoft.com/office/drawing/2016/5/10/chartex" xmlns:cx5="http://schemas.microsoft.com/office/drawing/2016/5/11/chartex" xmlns:cx6="http://schemas.microsoft.com/office/drawing/2016/5/12/chartex" xmlns:cx7="http://schemas.microsoft.com/office/drawing/2016/5/13/chartex" xmlns:cx8="http://schemas.microsoft.com/office/drawing/2016/5/14/chartex" xmlns:mc="http://schemas.openxmlformats.org/markup-compatibility/2006" xmlns:aink="http://schemas.microsoft.com/office/drawing/2016/ink" xmlns:am3d="http://schemas.microsoft.com/office/drawing/2017/model3d" xmlns:o="urn:schemas-microsoft-com:office:office" xmlns:oel="http://schemas.microsoft.com/office/2019/extlst" xmlns:r="http://schemas.openxmlformats.org/officeDocument/2006/relationships" xmlns:m="http://schemas.openxmlformats.org/officeDocument/2006/math" xmlns:v="urn:schemas-microsoft-com:vml" xmlns:wp14="http://schemas.microsoft.com/office/word/2010/wordprocessingDrawing" xmlns:wp="http://schemas.openxmlformats.org/drawingml/2006/wordprocessingDrawing" xmlns:w10="urn:schemas-microsoft-com:office:word" xmlns:w="http://schemas.openxmlformats.org/wordprocessingml/2006/main" xmlns:w14="http://schemas.microsoft.com/office/word/2010/wordml" xmlns:w15="http://schemas.microsoft.com/office/word/2012/wordml" xmlns:w16cex="http://schemas.microsoft.com/office/word/2018/wordml/cex" xmlns:w16cid="http://schemas.microsoft.com/office/word/2016/wordml/cid" xmlns:w16="http://schemas.microsoft.com/office/word/2018/wordml" xmlns:w16du="http://schemas.microsoft.com/office/word/2023/wordml/word16du" xmlns:w16sdtdh="http://schemas.microsoft.com/office/word/2020/wordml/sdtdatahash" xmlns:w16sdtfl="http://schemas.microsoft.com/office/word/2024/wordml/sdtformatlock" xmlns:w16se="http://schemas.microsoft.com/office/word/2015/wordml/symex" xmlns:wpg="http://schemas.microsoft.com/office/word/2010/wordprocessingGroup" xmlns:wpi="http://schemas.microsoft.com/office/word/2010/wordprocessingInk" xmlns:wne="http://schemas.microsoft.com/office/word/2006/wordml" xmlns:wps="http://schemas.microsoft.com/office/word/2010/wordprocessingShape" mc:Ignorable="w14 w15 w16se w16cid w16 w16cex w16sdtdh w16sdtfl w16du wp14">
   <w:abstractNum w:abstractNumId="0" w15:restartNumberingAfterBreak="0">
+    <w:nsid w:val="159702AC"/>
+    <w:multiLevelType w:val="hybridMultilevel"/>
+    <w:tmpl w:val="58C29B46"/>
+    <w:lvl w:ilvl="0" w:tplc="04090001">
+      <w:start w:val="1"/>
+      <w:numFmt w:val="bullet"/>
+      <w:lvlText w:val=""/>
+      <w:lvlJc w:val="left"/>
+      <w:pPr>
+        <w:ind w:left="705" w:hanging="360"/>
+      </w:pPr>
+      <w:rPr>
+        <w:rFonts w:ascii="Symbol" w:hAnsi="Symbol" w:hint="default"/>
+      </w:rPr>
+    </w:lvl>
+    <w:lvl w:ilvl="1" w:tplc="04090003">
+      <w:start w:val="1"/>
+      <w:numFmt w:val="bullet"/>
+      <w:lvlText w:val="o"/>
+      <w:lvlJc w:val="left"/>
+      <w:pPr>
+        <w:ind w:left="1425" w:hanging="360"/>
+      </w:pPr>
+      <w:rPr>
+        <w:rFonts w:ascii="Courier New" w:hAnsi="Courier New" w:cs="Courier New" w:hint="default"/>
+      </w:rPr>
+    </w:lvl>
+    <w:lvl w:ilvl="2" w:tplc="04090005" w:tentative="1">
+      <w:start w:val="1"/>
+      <w:numFmt w:val="bullet"/>
+      <w:lvlText w:val=""/>
+      <w:lvlJc w:val="left"/>
+      <w:pPr>
+        <w:ind w:left="2145" w:hanging="360"/>
+      </w:pPr>
+      <w:rPr>
+        <w:rFonts w:ascii="Wingdings" w:hAnsi="Wingdings" w:hint="default"/>
+      </w:rPr>
+    </w:lvl>
+    <w:lvl w:ilvl="3" w:tplc="04090001" w:tentative="1">
+      <w:start w:val="1"/>
+      <w:numFmt w:val="bullet"/>
+      <w:lvlText w:val=""/>
+      <w:lvlJc w:val="left"/>
+      <w:pPr>
+        <w:ind w:left="2865" w:hanging="360"/>
+      </w:pPr>
+      <w:rPr>
+        <w:rFonts w:ascii="Symbol" w:hAnsi="Symbol" w:hint="default"/>
+      </w:rPr>
+    </w:lvl>
+    <w:lvl w:ilvl="4" w:tplc="04090003" w:tentative="1">
+      <w:start w:val="1"/>
+      <w:numFmt w:val="bullet"/>
+      <w:lvlText w:val="o"/>
+      <w:lvlJc w:val="left"/>
+      <w:pPr>
+        <w:ind w:left="3585" w:hanging="360"/>
+      </w:pPr>
+      <w:rPr>
+        <w:rFonts w:ascii="Courier New" w:hAnsi="Courier New" w:cs="Courier New" w:hint="default"/>
+      </w:rPr>
+    </w:lvl>
+    <w:lvl w:ilvl="5" w:tplc="04090005" w:tentative="1">
+      <w:start w:val="1"/>
+      <w:numFmt w:val="bullet"/>
+      <w:lvlText w:val=""/>
+      <w:lvlJc w:val="left"/>
+      <w:pPr>
+        <w:ind w:left="4305" w:hanging="360"/>
+      </w:pPr>
+      <w:rPr>
+        <w:rFonts w:ascii="Wingdings" w:hAnsi="Wingdings" w:hint="default"/>
+      </w:rPr>
+    </w:lvl>
+    <w:lvl w:ilvl="6" w:tplc="04090001" w:tentative="1">
+      <w:start w:val="1"/>
+      <w:numFmt w:val="bullet"/>
+      <w:lvlText w:val=""/>
+      <w:lvlJc w:val="left"/>
+      <w:pPr>
+        <w:ind w:left="5025" w:hanging="360"/>
+      </w:pPr>
+      <w:rPr>
+        <w:rFonts w:ascii="Symbol" w:hAnsi="Symbol" w:hint="default"/>
+      </w:rPr>
+    </w:lvl>
+    <w:lvl w:ilvl="7" w:tplc="04090003" w:tentative="1">
+      <w:start w:val="1"/>
+      <w:numFmt w:val="bullet"/>
+      <w:lvlText w:val="o"/>
+      <w:lvlJc w:val="left"/>
+      <w:pPr>
+        <w:ind w:left="5745" w:hanging="360"/>
+      </w:pPr>
+      <w:rPr>
+        <w:rFonts w:ascii="Courier New" w:hAnsi="Courier New" w:cs="Courier New" w:hint="default"/>
+      </w:rPr>
+    </w:lvl>
+    <w:lvl w:ilvl="8" w:tplc="04090005" w:tentative="1">
+      <w:start w:val="1"/>
+      <w:numFmt w:val="bullet"/>
+      <w:lvlText w:val=""/>
+      <w:lvlJc w:val="left"/>
+      <w:pPr>
+        <w:ind w:left="6465" w:hanging="360"/>
+      </w:pPr>
+      <w:rPr>
+        <w:rFonts w:ascii="Wingdings" w:hAnsi="Wingdings" w:hint="default"/>
+      </w:rPr>
+    </w:lvl>
+  </w:abstractNum>
+  <w:abstractNum w:abstractNumId="1" w15:restartNumberingAfterBreak="0">
+    <w:nsid w:val="15FD4E81"/>
+    <w:multiLevelType w:val="multilevel"/>
+    <w:tmpl w:val="EF1ED68A"/>
+    <w:lvl w:ilvl="0">
+      <w:start w:val="1"/>
+      <w:numFmt w:val="bullet"/>
+      <w:lvlText w:val=""/>
+      <w:lvlJc w:val="left"/>
+      <w:pPr>
+        <w:tabs>
+          <w:tab w:val="num" w:pos="720"/>
+        </w:tabs>
+        <w:ind w:left="720" w:hanging="360"/>
+      </w:pPr>
+      <w:rPr>
+        <w:rFonts w:ascii="Symbol" w:hAnsi="Symbol" w:hint="default"/>
+        <w:sz w:val="20"/>
+      </w:rPr>
+    </w:lvl>
+    <w:lvl w:ilvl="1" w:tentative="1">
+      <w:start w:val="1"/>
+      <w:numFmt w:val="bullet"/>
+      <w:lvlText w:val="o"/>
+      <w:lvlJc w:val="left"/>
+      <w:pPr>
+        <w:tabs>
+          <w:tab w:val="num" w:pos="1440"/>
+        </w:tabs>
+        <w:ind w:left="1440" w:hanging="360"/>
+      </w:pPr>
+      <w:rPr>
+        <w:rFonts w:ascii="Courier New" w:hAnsi="Courier New" w:hint="default"/>
+        <w:sz w:val="20"/>
+      </w:rPr>
+    </w:lvl>
+    <w:lvl w:ilvl="2" w:tentative="1">
+      <w:start w:val="1"/>
+      <w:numFmt w:val="bullet"/>
+      <w:lvlText w:val=""/>
+      <w:lvlJc w:val="left"/>
+      <w:pPr>
+        <w:tabs>
+          <w:tab w:val="num" w:pos="2160"/>
+        </w:tabs>
+        <w:ind w:left="2160" w:hanging="360"/>
+      </w:pPr>
+      <w:rPr>
+        <w:rFonts w:ascii="Wingdings" w:hAnsi="Wingdings" w:hint="default"/>
+        <w:sz w:val="20"/>
+      </w:rPr>
+    </w:lvl>
+    <w:lvl w:ilvl="3" w:tentative="1">
+      <w:start w:val="1"/>
+      <w:numFmt w:val="bullet"/>
+      <w:lvlText w:val=""/>
+      <w:lvlJc w:val="left"/>
+      <w:pPr>
+        <w:tabs>
+          <w:tab w:val="num" w:pos="2880"/>
+        </w:tabs>
+        <w:ind w:left="2880" w:hanging="360"/>
+      </w:pPr>
+      <w:rPr>
+        <w:rFonts w:ascii="Wingdings" w:hAnsi="Wingdings" w:hint="default"/>
+        <w:sz w:val="20"/>
+      </w:rPr>
+    </w:lvl>
+    <w:lvl w:ilvl="4" w:tentative="1">
+      <w:start w:val="1"/>
+      <w:numFmt w:val="bullet"/>
+      <w:lvlText w:val=""/>
+      <w:lvlJc w:val="left"/>
+      <w:pPr>
+        <w:tabs>
+          <w:tab w:val="num" w:pos="3600"/>
+        </w:tabs>
+        <w:ind w:left="3600" w:hanging="360"/>
+      </w:pPr>
+      <w:rPr>
+        <w:rFonts w:ascii="Wingdings" w:hAnsi="Wingdings" w:hint="default"/>
+        <w:sz w:val="20"/>
+      </w:rPr>
+    </w:lvl>
+    <w:lvl w:ilvl="5" w:tentative="1">
+      <w:start w:val="1"/>
+      <w:numFmt w:val="bullet"/>
+      <w:lvlText w:val=""/>
+      <w:lvlJc w:val="left"/>
+      <w:pPr>
+        <w:tabs>
+          <w:tab w:val="num" w:pos="4320"/>
+        </w:tabs>
+        <w:ind w:left="4320" w:hanging="360"/>
+      </w:pPr>
+      <w:rPr>
+        <w:rFonts w:ascii="Wingdings" w:hAnsi="Wingdings" w:hint="default"/>
+        <w:sz w:val="20"/>
+      </w:rPr>
+    </w:lvl>
+    <w:lvl w:ilvl="6" w:tentative="1">
+      <w:start w:val="1"/>
+      <w:numFmt w:val="bullet"/>
+      <w:lvlText w:val=""/>
+      <w:lvlJc w:val="left"/>
+      <w:pPr>
+        <w:tabs>
+          <w:tab w:val="num" w:pos="5040"/>
+        </w:tabs>
+        <w:ind w:left="5040" w:hanging="360"/>
+      </w:pPr>
+      <w:rPr>
+        <w:rFonts w:ascii="Wingdings" w:hAnsi="Wingdings" w:hint="default"/>
+        <w:sz w:val="20"/>
+      </w:rPr>
+    </w:lvl>
+    <w:lvl w:ilvl="7" w:tentative="1">
+      <w:start w:val="1"/>
+      <w:numFmt w:val="bullet"/>
+      <w:lvlText w:val=""/>
+      <w:lvlJc w:val="left"/>
+      <w:pPr>
+        <w:tabs>
+          <w:tab w:val="num" w:pos="5760"/>
+        </w:tabs>
+        <w:ind w:left="5760" w:hanging="360"/>
+      </w:pPr>
+      <w:rPr>
+        <w:rFonts w:ascii="Wingdings" w:hAnsi="Wingdings" w:hint="default"/>
+        <w:sz w:val="20"/>
+      </w:rPr>
+    </w:lvl>
+    <w:lvl w:ilvl="8" w:tentative="1">
+      <w:start w:val="1"/>
+      <w:numFmt w:val="bullet"/>
+      <w:lvlText w:val=""/>
+      <w:lvlJc w:val="left"/>
+      <w:pPr>
+        <w:tabs>
+          <w:tab w:val="num" w:pos="6480"/>
+        </w:tabs>
+        <w:ind w:left="6480" w:hanging="360"/>
+      </w:pPr>
+      <w:rPr>
+        <w:rFonts w:ascii="Wingdings" w:hAnsi="Wingdings" w:hint="default"/>
+        <w:sz w:val="20"/>
+      </w:rPr>
+    </w:lvl>
+  </w:abstractNum>
+  <w:abstractNum w:abstractNumId="2" w15:restartNumberingAfterBreak="0">
+    <w:nsid w:val="1A1666CF"/>
+    <w:multiLevelType w:val="hybridMultilevel"/>
+    <w:tmpl w:val="B8FE74A6"/>
+    <w:lvl w:ilvl="0" w:tplc="04090001">
+      <w:start w:val="1"/>
+      <w:numFmt w:val="bullet"/>
+      <w:lvlText w:val=""/>
+      <w:lvlJc w:val="left"/>
+      <w:pPr>
+        <w:ind w:left="720" w:hanging="360"/>
+      </w:pPr>
+      <w:rPr>
+        <w:rFonts w:ascii="Symbol" w:hAnsi="Symbol" w:hint="default"/>
+      </w:rPr>
+    </w:lvl>
+    <w:lvl w:ilvl="1" w:tplc="04090003" w:tentative="1">
+      <w:start w:val="1"/>
+      <w:numFmt w:val="bullet"/>
+      <w:lvlText w:val="o"/>
+      <w:lvlJc w:val="left"/>
+      <w:pPr>
+        <w:ind w:left="1440" w:hanging="360"/>
+      </w:pPr>
+      <w:rPr>
+        <w:rFonts w:ascii="Courier New" w:hAnsi="Courier New" w:cs="Courier New" w:hint="default"/>
+      </w:rPr>
+    </w:lvl>
+    <w:lvl w:ilvl="2" w:tplc="04090005" w:tentative="1">
+      <w:start w:val="1"/>
+      <w:numFmt w:val="bullet"/>
+      <w:lvlText w:val=""/>
+      <w:lvlJc w:val="left"/>
+      <w:pPr>
+        <w:ind w:left="2160" w:hanging="360"/>
+      </w:pPr>
+      <w:rPr>
+        <w:rFonts w:ascii="Wingdings" w:hAnsi="Wingdings" w:hint="default"/>
+      </w:rPr>
+    </w:lvl>
+    <w:lvl w:ilvl="3" w:tplc="04090001" w:tentative="1">
+      <w:start w:val="1"/>
+      <w:numFmt w:val="bullet"/>
+      <w:lvlText w:val=""/>
+      <w:lvlJc w:val="left"/>
+      <w:pPr>
+        <w:ind w:left="2880" w:hanging="360"/>
+      </w:pPr>
+      <w:rPr>
+        <w:rFonts w:ascii="Symbol" w:hAnsi="Symbol" w:hint="default"/>
+      </w:rPr>
+    </w:lvl>
+    <w:lvl w:ilvl="4" w:tplc="04090003" w:tentative="1">
+      <w:start w:val="1"/>
+      <w:numFmt w:val="bullet"/>
+      <w:lvlText w:val="o"/>
+      <w:lvlJc w:val="left"/>
+      <w:pPr>
+        <w:ind w:left="3600" w:hanging="360"/>
+      </w:pPr>
+      <w:rPr>
+        <w:rFonts w:ascii="Courier New" w:hAnsi="Courier New" w:cs="Courier New" w:hint="default"/>
+      </w:rPr>
+    </w:lvl>
+    <w:lvl w:ilvl="5" w:tplc="04090005" w:tentative="1">
+      <w:start w:val="1"/>
+      <w:numFmt w:val="bullet"/>
+      <w:lvlText w:val=""/>
+      <w:lvlJc w:val="left"/>
+      <w:pPr>
+        <w:ind w:left="4320" w:hanging="360"/>
+      </w:pPr>
+      <w:rPr>
+        <w:rFonts w:ascii="Wingdings" w:hAnsi="Wingdings" w:hint="default"/>
+      </w:rPr>
+    </w:lvl>
+    <w:lvl w:ilvl="6" w:tplc="04090001" w:tentative="1">
+      <w:start w:val="1"/>
+      <w:numFmt w:val="bullet"/>
+      <w:lvlText w:val=""/>
+      <w:lvlJc w:val="left"/>
+      <w:pPr>
+        <w:ind w:left="5040" w:hanging="360"/>
+      </w:pPr>
+      <w:rPr>
+        <w:rFonts w:ascii="Symbol" w:hAnsi="Symbol" w:hint="default"/>
+      </w:rPr>
+    </w:lvl>
+    <w:lvl w:ilvl="7" w:tplc="04090003" w:tentative="1">
+      <w:start w:val="1"/>
+      <w:numFmt w:val="bullet"/>
+      <w:lvlText w:val="o"/>
+      <w:lvlJc w:val="left"/>
+      <w:pPr>
+        <w:ind w:left="5760" w:hanging="360"/>
+      </w:pPr>
+      <w:rPr>
+        <w:rFonts w:ascii="Courier New" w:hAnsi="Courier New" w:cs="Courier New" w:hint="default"/>
+      </w:rPr>
+    </w:lvl>
+    <w:lvl w:ilvl="8" w:tplc="04090005" w:tentative="1">
+      <w:start w:val="1"/>
+      <w:numFmt w:val="bullet"/>
+      <w:lvlText w:val=""/>
+      <w:lvlJc w:val="left"/>
+      <w:pPr>
+        <w:ind w:left="6480" w:hanging="360"/>
+      </w:pPr>
+      <w:rPr>
+        <w:rFonts w:ascii="Wingdings" w:hAnsi="Wingdings" w:hint="default"/>
+      </w:rPr>
+    </w:lvl>
+  </w:abstractNum>
+  <w:abstractNum w:abstractNumId="3" w15:restartNumberingAfterBreak="0">
+    <w:nsid w:val="23D5557F"/>
+    <w:multiLevelType w:val="hybridMultilevel"/>
+    <w:tmpl w:val="4C64FC80"/>
+    <w:lvl w:ilvl="0" w:tplc="04090001">
+      <w:start w:val="1"/>
+      <w:numFmt w:val="bullet"/>
+      <w:lvlText w:val=""/>
+      <w:lvlJc w:val="left"/>
+      <w:pPr>
+        <w:ind w:left="705" w:hanging="360"/>
+      </w:pPr>
+      <w:rPr>
+        <w:rFonts w:ascii="Symbol" w:hAnsi="Symbol" w:hint="default"/>
+      </w:rPr>
+    </w:lvl>
+    <w:lvl w:ilvl="1" w:tplc="04090003" w:tentative="1">
+      <w:start w:val="1"/>
+      <w:numFmt w:val="bullet"/>
+      <w:lvlText w:val="o"/>
+      <w:lvlJc w:val="left"/>
+      <w:pPr>
+        <w:ind w:left="1425" w:hanging="360"/>
+      </w:pPr>
+      <w:rPr>
+        <w:rFonts w:ascii="Courier New" w:hAnsi="Courier New" w:cs="Courier New" w:hint="default"/>
+      </w:rPr>
+    </w:lvl>
+    <w:lvl w:ilvl="2" w:tplc="04090005" w:tentative="1">
+      <w:start w:val="1"/>
+      <w:numFmt w:val="bullet"/>
+      <w:lvlText w:val=""/>
+      <w:lvlJc w:val="left"/>
+      <w:pPr>
+        <w:ind w:left="2145" w:hanging="360"/>
+      </w:pPr>
+      <w:rPr>
+        <w:rFonts w:ascii="Wingdings" w:hAnsi="Wingdings" w:hint="default"/>
+      </w:rPr>
+    </w:lvl>
+    <w:lvl w:ilvl="3" w:tplc="04090001" w:tentative="1">
+      <w:start w:val="1"/>
+      <w:numFmt w:val="bullet"/>
+      <w:lvlText w:val=""/>
+      <w:lvlJc w:val="left"/>
+      <w:pPr>
+        <w:ind w:left="2865" w:hanging="360"/>
+      </w:pPr>
+      <w:rPr>
+        <w:rFonts w:ascii="Symbol" w:hAnsi="Symbol" w:hint="default"/>
+      </w:rPr>
+    </w:lvl>
+    <w:lvl w:ilvl="4" w:tplc="04090003" w:tentative="1">
+      <w:start w:val="1"/>
+      <w:numFmt w:val="bullet"/>
+      <w:lvlText w:val="o"/>
+      <w:lvlJc w:val="left"/>
+      <w:pPr>
+        <w:ind w:left="3585" w:hanging="360"/>
+      </w:pPr>
+      <w:rPr>
+        <w:rFonts w:ascii="Courier New" w:hAnsi="Courier New" w:cs="Courier New" w:hint="default"/>
+      </w:rPr>
+    </w:lvl>
+    <w:lvl w:ilvl="5" w:tplc="04090005" w:tentative="1">
+      <w:start w:val="1"/>
+      <w:numFmt w:val="bullet"/>
+      <w:lvlText w:val=""/>
+      <w:lvlJc w:val="left"/>
+      <w:pPr>
+        <w:ind w:left="4305" w:hanging="360"/>
+      </w:pPr>
+      <w:rPr>
+        <w:rFonts w:ascii="Wingdings" w:hAnsi="Wingdings" w:hint="default"/>
+      </w:rPr>
+    </w:lvl>
+    <w:lvl w:ilvl="6" w:tplc="04090001" w:tentative="1">
+      <w:start w:val="1"/>
+      <w:numFmt w:val="bullet"/>
+      <w:lvlText w:val=""/>
+      <w:lvlJc w:val="left"/>
+      <w:pPr>
+        <w:ind w:left="5025" w:hanging="360"/>
+      </w:pPr>
+      <w:rPr>
+        <w:rFonts w:ascii="Symbol" w:hAnsi="Symbol" w:hint="default"/>
+      </w:rPr>
+    </w:lvl>
+    <w:lvl w:ilvl="7" w:tplc="04090003" w:tentative="1">
+      <w:start w:val="1"/>
+      <w:numFmt w:val="bullet"/>
+      <w:lvlText w:val="o"/>
+      <w:lvlJc w:val="left"/>
+      <w:pPr>
+        <w:ind w:left="5745" w:hanging="360"/>
+      </w:pPr>
+      <w:rPr>
+        <w:rFonts w:ascii="Courier New" w:hAnsi="Courier New" w:cs="Courier New" w:hint="default"/>
+      </w:rPr>
+    </w:lvl>
+    <w:lvl w:ilvl="8" w:tplc="04090005" w:tentative="1">
+      <w:start w:val="1"/>
+      <w:numFmt w:val="bullet"/>
+      <w:lvlText w:val=""/>
+      <w:lvlJc w:val="left"/>
+      <w:pPr>
+        <w:ind w:left="6465" w:hanging="360"/>
+      </w:pPr>
+      <w:rPr>
+        <w:rFonts w:ascii="Wingdings" w:hAnsi="Wingdings" w:hint="default"/>
+      </w:rPr>
+    </w:lvl>
+  </w:abstractNum>
+  <w:abstractNum w:abstractNumId="4" w15:restartNumberingAfterBreak="0">
     <w:nsid w:val="24B44616"/>
     <w:multiLevelType w:val="hybridMultilevel"/>
     <w:tmpl w:val="04A6CBFA"/>
@@ -595,7 +1709,19 @@
     </w:lvl>
   </w:abstractNum>
   <w:num w:numId="1" w16cid:durableId="1335303603">
+    <w:abstractNumId w:val="4"/>
+  </w:num>
+  <w:num w:numId="2" w16cid:durableId="855074419">
     <w:abstractNumId w:val="0"/>
+  </w:num>
+  <w:num w:numId="3" w16cid:durableId="47463625">
+    <w:abstractNumId w:val="3"/>
+  </w:num>
+  <w:num w:numId="4" w16cid:durableId="1069233852">
+    <w:abstractNumId w:val="2"/>
+  </w:num>
+  <w:num w:numId="5" w16cid:durableId="208692891">
+    <w:abstractNumId w:val="1"/>
   </w:num>
 </w:numbering>
 </file>
@@ -1037,6 +2163,86 @@
     <w:semiHidden/>
     <w:unhideWhenUsed/>
   </w:style>
+  <w:style w:type="table" w:styleId="TableGrid">
+    <w:name w:val="Table Grid"/>
+    <w:basedOn w:val="TableNormal"/>
+    <w:uiPriority w:val="39"/>
+    <w:rsid w:val="00AE7840"/>
+    <w:pPr>
+      <w:spacing w:after="0" w:line="240" w:lineRule="auto"/>
+    </w:pPr>
+    <w:tblPr>
+      <w:tblBorders>
+        <w:top w:val="single" w:sz="4" w:space="0" w:color="auto"/>
+        <w:left w:val="single" w:sz="4" w:space="0" w:color="auto"/>
+        <w:bottom w:val="single" w:sz="4" w:space="0" w:color="auto"/>
+        <w:right w:val="single" w:sz="4" w:space="0" w:color="auto"/>
+        <w:insideH w:val="single" w:sz="4" w:space="0" w:color="auto"/>
+        <w:insideV w:val="single" w:sz="4" w:space="0" w:color="auto"/>
+      </w:tblBorders>
+    </w:tblPr>
+  </w:style>
+  <w:style w:type="character" w:styleId="Hyperlink">
+    <w:name w:val="Hyperlink"/>
+    <w:basedOn w:val="DefaultParagraphFont"/>
+    <w:uiPriority w:val="99"/>
+    <w:unhideWhenUsed/>
+    <w:rsid w:val="00AE7840"/>
+    <w:rPr>
+      <w:color w:val="467886" w:themeColor="hyperlink"/>
+      <w:u w:val="single"/>
+    </w:rPr>
+  </w:style>
+  <w:style w:type="character" w:styleId="UnresolvedMention">
+    <w:name w:val="Unresolved Mention"/>
+    <w:basedOn w:val="DefaultParagraphFont"/>
+    <w:uiPriority w:val="99"/>
+    <w:semiHidden/>
+    <w:unhideWhenUsed/>
+    <w:rsid w:val="00AE7840"/>
+    <w:rPr>
+      <w:color w:val="605E5C"/>
+      <w:shd w:val="clear" w:color="auto" w:fill="E1DFDD"/>
+    </w:rPr>
+  </w:style>
+  <w:style w:type="paragraph" w:styleId="ListParagraph">
+    <w:name w:val="List Paragraph"/>
+    <w:basedOn w:val="Normal"/>
+    <w:uiPriority w:val="34"/>
+    <w:qFormat/>
+    <w:rsid w:val="00C32F2D"/>
+    <w:pPr>
+      <w:ind w:left="720"/>
+      <w:contextualSpacing/>
+    </w:pPr>
+  </w:style>
+  <w:style w:type="character" w:styleId="FollowedHyperlink">
+    <w:name w:val="FollowedHyperlink"/>
+    <w:basedOn w:val="DefaultParagraphFont"/>
+    <w:uiPriority w:val="99"/>
+    <w:semiHidden/>
+    <w:unhideWhenUsed/>
+    <w:rsid w:val="007E79F4"/>
+    <w:rPr>
+      <w:color w:val="96607D" w:themeColor="followedHyperlink"/>
+      <w:u w:val="single"/>
+    </w:rPr>
+  </w:style>
+  <w:style w:type="paragraph" w:styleId="Revision">
+    <w:name w:val="Revision"/>
+    <w:hidden/>
+    <w:uiPriority w:val="99"/>
+    <w:semiHidden/>
+    <w:rsid w:val="00CC63C0"/>
+    <w:pPr>
+      <w:spacing w:after="0" w:line="240" w:lineRule="auto"/>
+    </w:pPr>
+    <w:rPr>
+      <w:rFonts w:ascii="Times New Roman" w:eastAsia="Times New Roman" w:hAnsi="Times New Roman" w:cs="Times New Roman"/>
+      <w:color w:val="000000"/>
+      <w:sz w:val="22"/>
+    </w:rPr>
+  </w:style>
 </w:styles>
 </file>
 
@@ -1353,4 +2559,16 @@
     </a:ext>
   </a:extLst>
 </a:theme>
+</file>
+
+<file path=customXml/item1.xml><?xml version="1.0" encoding="utf-8"?>
+<b:Sources xmlns:b="http://schemas.openxmlformats.org/officeDocument/2006/bibliography" xmlns="http://schemas.openxmlformats.org/officeDocument/2006/bibliography" SelectedStyle="\APASixthEditionOfficeOnline.xsl" StyleName="APA" Version="6"/>
+</file>
+
+<file path=customXml/itemProps1.xml><?xml version="1.0" encoding="utf-8"?>
+<ds:datastoreItem xmlns:ds="http://schemas.openxmlformats.org/officeDocument/2006/customXml" ds:itemID="{7A67DAFB-59AB-42D4-8F03-17A3DB4F8306}">
+  <ds:schemaRefs>
+    <ds:schemaRef ds:uri="http://schemas.openxmlformats.org/officeDocument/2006/bibliography"/>
+  </ds:schemaRefs>
+</ds:datastoreItem>
 </file>
</xml_diff>